<commit_message>
# update two squirrels moving
</commit_message>
<xml_diff>
--- a/Tables/table_discovery.docx
+++ b/Tables/table_discovery.docx
@@ -448,7 +448,7 @@
                 <w:szCs w:val="22"/>
                 <w:color w:val="000000"/>
               </w:rPr>
-              <w:t xml:space="preserve">1.07</w:t>
+              <w:t xml:space="preserve">1.06</w:t>
             </w:r>
           </w:p>
         </w:tc>
@@ -501,7 +501,7 @@
                 <w:szCs w:val="22"/>
                 <w:color w:val="000000"/>
               </w:rPr>
-              <w:t xml:space="preserve">0.90</w:t>
+              <w:t xml:space="preserve">0.89</w:t>
             </w:r>
           </w:p>
         </w:tc>
@@ -607,7 +607,7 @@
                 <w:szCs w:val="22"/>
                 <w:color w:val="000000"/>
               </w:rPr>
-              <w:t xml:space="preserve">0.82</w:t>
+              <w:t xml:space="preserve">0.65</w:t>
             </w:r>
           </w:p>
         </w:tc>
@@ -660,14 +660,14 @@
                 <w:szCs w:val="22"/>
                 <w:color w:val="000000"/>
               </w:rPr>
-              <w:t xml:space="preserve">0.4100</w:t>
+              <w:t xml:space="preserve">0.5100</w:t>
             </w:r>
           </w:p>
         </w:tc>
       </w:tr>
       <w:tr>
         <w:trPr>
-          <w:trHeight w:val="571" w:hRule="auto"/>
+          <w:trHeight w:val="572" w:hRule="auto"/>
         </w:trPr>
         body2
         <w:tc>
@@ -825,7 +825,7 @@
                 <w:szCs w:val="22"/>
                 <w:color w:val="000000"/>
               </w:rPr>
-              <w:t xml:space="preserve">1.12</w:t>
+              <w:t xml:space="preserve">1.11</w:t>
             </w:r>
           </w:p>
         </w:tc>
@@ -931,7 +931,7 @@
                 <w:szCs w:val="22"/>
                 <w:color w:val="000000"/>
               </w:rPr>
-              <w:t xml:space="preserve">2.69</w:t>
+              <w:t xml:space="preserve">2.64</w:t>
             </w:r>
           </w:p>
         </w:tc>
@@ -984,7 +984,7 @@
                 <w:szCs w:val="22"/>
                 <w:color w:val="000000"/>
               </w:rPr>
-              <w:t xml:space="preserve">0.0071</w:t>
+              <w:t xml:space="preserve">0.0083</w:t>
             </w:r>
           </w:p>
         </w:tc>
@@ -1096,7 +1096,7 @@
                 <w:szCs w:val="22"/>
                 <w:color w:val="000000"/>
               </w:rPr>
-              <w:t xml:space="preserve">0.98</w:t>
+              <w:t xml:space="preserve">0.99</w:t>
             </w:r>
           </w:p>
         </w:tc>
@@ -1202,7 +1202,7 @@
                 <w:szCs w:val="22"/>
                 <w:color w:val="000000"/>
               </w:rPr>
-              <w:t xml:space="preserve">1.15</w:t>
+              <w:t xml:space="preserve">1.17</w:t>
             </w:r>
           </w:p>
         </w:tc>
@@ -1255,7 +1255,7 @@
                 <w:szCs w:val="22"/>
                 <w:color w:val="000000"/>
               </w:rPr>
-              <w:t xml:space="preserve">-0.23</w:t>
+              <w:t xml:space="preserve">-0.09</w:t>
             </w:r>
           </w:p>
         </w:tc>
@@ -1308,7 +1308,7 @@
                 <w:szCs w:val="22"/>
                 <w:color w:val="000000"/>
               </w:rPr>
-              <w:t xml:space="preserve">0.8200</w:t>
+              <w:t xml:space="preserve">0.9300</w:t>
             </w:r>
           </w:p>
         </w:tc>
@@ -1420,7 +1420,7 @@
                 <w:szCs w:val="22"/>
                 <w:color w:val="000000"/>
               </w:rPr>
-              <w:t xml:space="preserve">0.91</w:t>
+              <w:t xml:space="preserve">0.89</w:t>
             </w:r>
           </w:p>
         </w:tc>
@@ -1473,7 +1473,7 @@
                 <w:szCs w:val="22"/>
                 <w:color w:val="000000"/>
               </w:rPr>
-              <w:t xml:space="preserve">0.75</w:t>
+              <w:t xml:space="preserve">0.73</w:t>
             </w:r>
           </w:p>
         </w:tc>
@@ -1526,7 +1526,7 @@
                 <w:szCs w:val="22"/>
                 <w:color w:val="000000"/>
               </w:rPr>
-              <w:t xml:space="preserve">1.10</w:t>
+              <w:t xml:space="preserve">1.09</w:t>
             </w:r>
           </w:p>
         </w:tc>
@@ -1579,7 +1579,7 @@
                 <w:szCs w:val="22"/>
                 <w:color w:val="000000"/>
               </w:rPr>
-              <w:t xml:space="preserve">-1.01</w:t>
+              <w:t xml:space="preserve">-1.14</w:t>
             </w:r>
           </w:p>
         </w:tc>
@@ -1632,7 +1632,7 @@
                 <w:szCs w:val="22"/>
                 <w:color w:val="000000"/>
               </w:rPr>
-              <w:t xml:space="preserve">0.3100</w:t>
+              <w:t xml:space="preserve">0.2500</w:t>
             </w:r>
           </w:p>
         </w:tc>
@@ -1744,7 +1744,7 @@
                 <w:szCs w:val="22"/>
                 <w:color w:val="000000"/>
               </w:rPr>
-              <w:t xml:space="preserve">0.59</w:t>
+              <w:t xml:space="preserve">0.58</w:t>
             </w:r>
           </w:p>
         </w:tc>
@@ -1956,7 +1956,7 @@
                 <w:szCs w:val="22"/>
                 <w:color w:val="000000"/>
               </w:rPr>
-              <w:t xml:space="preserve">0.0310</w:t>
+              <w:t xml:space="preserve">0.0320</w:t>
             </w:r>
           </w:p>
         </w:tc>
@@ -2068,7 +2068,7 @@
                 <w:szCs w:val="22"/>
                 <w:color w:val="000000"/>
               </w:rPr>
-              <w:t xml:space="preserve">1.22</w:t>
+              <w:t xml:space="preserve">1.21</w:t>
             </w:r>
           </w:p>
         </w:tc>
@@ -2174,7 +2174,7 @@
                 <w:szCs w:val="22"/>
                 <w:color w:val="000000"/>
               </w:rPr>
-              <w:t xml:space="preserve">1.56</w:t>
+              <w:t xml:space="preserve">1.55</w:t>
             </w:r>
           </w:p>
         </w:tc>
@@ -2227,7 +2227,7 @@
                 <w:szCs w:val="22"/>
                 <w:color w:val="000000"/>
               </w:rPr>
-              <w:t xml:space="preserve">1.59</w:t>
+              <w:t xml:space="preserve">1.52</w:t>
             </w:r>
           </w:p>
         </w:tc>
@@ -2280,7 +2280,7 @@
                 <w:szCs w:val="22"/>
                 <w:color w:val="000000"/>
               </w:rPr>
-              <w:t xml:space="preserve">0.1100</w:t>
+              <w:t xml:space="preserve">0.1300</w:t>
             </w:r>
           </w:p>
         </w:tc>
@@ -2392,7 +2392,7 @@
                 <w:szCs w:val="22"/>
                 <w:color w:val="000000"/>
               </w:rPr>
-              <w:t xml:space="preserve">2.66</w:t>
+              <w:t xml:space="preserve">2.64</w:t>
             </w:r>
           </w:p>
         </w:tc>
@@ -2445,7 +2445,7 @@
                 <w:szCs w:val="22"/>
                 <w:color w:val="000000"/>
               </w:rPr>
-              <w:t xml:space="preserve">1.48</w:t>
+              <w:t xml:space="preserve">1.46</w:t>
             </w:r>
           </w:p>
         </w:tc>
@@ -2498,7 +2498,7 @@
                 <w:szCs w:val="22"/>
                 <w:color w:val="000000"/>
               </w:rPr>
-              <w:t xml:space="preserve">4.80</w:t>
+              <w:t xml:space="preserve">4.77</w:t>
             </w:r>
           </w:p>
         </w:tc>
@@ -2551,7 +2551,7 @@
                 <w:szCs w:val="22"/>
                 <w:color w:val="000000"/>
               </w:rPr>
-              <w:t xml:space="preserve">3.25</w:t>
+              <w:t xml:space="preserve">3.21</w:t>
             </w:r>
           </w:p>
         </w:tc>
@@ -2604,7 +2604,7 @@
                 <w:szCs w:val="22"/>
                 <w:color w:val="000000"/>
               </w:rPr>
-              <w:t xml:space="preserve">0.0011</w:t>
+              <w:t xml:space="preserve">0.0013</w:t>
             </w:r>
           </w:p>
         </w:tc>

</xml_diff>